<commit_message>
Knowledge - 2/17/2026 - part 4
</commit_message>
<xml_diff>
--- a/Knowledge/3-Work knowledge/1-Software Engineering/2-General Technologies/1-Version Control System/1-Git, GitHub and GitLab/5-My Source/3-Create Github Repository And Clone It.docx
+++ b/Knowledge/3-Work knowledge/1-Software Engineering/2-General Technologies/1-Version Control System/1-Git, GitHub and GitLab/5-My Source/3-Create Github Repository And Clone It.docx
@@ -690,7 +690,7 @@
           <w:szCs w:val="18"/>
           <w:highlight w:val="lightGray"/>
         </w:rPr>
-        <w:t xml:space="preserve">[Site: https://github.com/] </w:t>
+        <w:t xml:space="preserve">[Site: https://github.com] </w:t>
       </w:r>
       <w:r>
         <w:rPr>
@@ -841,45 +841,99 @@
         <w:t>repository</w:t>
       </w:r>
       <w:r>
+        <w:t xml:space="preserve"> Without Readme</w:t>
+      </w:r>
+    </w:p>
+    <w:p>
+      <w:pPr>
+        <w:rPr>
+          <w:rFonts w:ascii="Arial" w:eastAsia="Arial" w:hAnsi="Arial" w:cs="Arial"/>
+          <w:sz w:val="18"/>
+          <w:szCs w:val="18"/>
+        </w:rPr>
+      </w:pPr>
+      <w:r>
+        <w:rPr>
+          <w:rFonts w:ascii="Arial" w:eastAsia="Arial" w:hAnsi="Arial" w:cs="Arial"/>
+          <w:b/>
+          <w:bCs/>
+          <w:sz w:val="18"/>
+          <w:szCs w:val="18"/>
+          <w:highlight w:val="lightGray"/>
+        </w:rPr>
+        <w:t xml:space="preserve"># Source: </w:t>
+      </w:r>
+      <w:proofErr w:type="spellStart"/>
+      <w:r>
+        <w:rPr>
+          <w:rFonts w:ascii="Arial" w:eastAsia="Arial" w:hAnsi="Arial" w:cs="Arial"/>
+          <w:b/>
+          <w:bCs/>
+          <w:sz w:val="18"/>
+          <w:szCs w:val="18"/>
+          <w:highlight w:val="lightGray"/>
+        </w:rPr>
+        <w:t>ScreenShots</w:t>
+      </w:r>
+      <w:proofErr w:type="spellEnd"/>
+      <w:r>
+        <w:rPr>
+          <w:rFonts w:ascii="Arial" w:eastAsia="Arial" w:hAnsi="Arial" w:cs="Arial"/>
+          <w:sz w:val="18"/>
+          <w:szCs w:val="18"/>
+          <w:highlight w:val="lightGray"/>
+        </w:rPr>
         <w:t xml:space="preserve"> </w:t>
       </w:r>
       <w:r>
-        <w:t>Without</w:t>
-      </w:r>
-      <w:r>
-        <w:t xml:space="preserve"> Readme</w:t>
-      </w:r>
-    </w:p>
-    <w:p>
-      <w:pPr>
-        <w:rPr>
-          <w:rFonts w:ascii="Arial" w:eastAsia="Arial" w:hAnsi="Arial" w:cs="Arial"/>
-          <w:sz w:val="18"/>
-          <w:szCs w:val="18"/>
-        </w:rPr>
-      </w:pPr>
-      <w:r>
-        <w:rPr>
-          <w:rFonts w:ascii="Arial" w:eastAsia="Arial" w:hAnsi="Arial" w:cs="Arial"/>
-          <w:b/>
-          <w:bCs/>
-          <w:sz w:val="18"/>
-          <w:szCs w:val="18"/>
-          <w:highlight w:val="lightGray"/>
-        </w:rPr>
-        <w:t xml:space="preserve"># Source: </w:t>
+        <w:rPr>
+          <w:rFonts w:ascii="Arial" w:eastAsia="Arial" w:hAnsi="Arial" w:cs="Arial"/>
+          <w:b/>
+          <w:bCs/>
+          <w:sz w:val="18"/>
+          <w:szCs w:val="18"/>
+          <w:highlight w:val="lightGray"/>
+        </w:rPr>
+        <w:t>Source</w:t>
+      </w:r>
+      <w:r>
+        <w:rPr>
+          <w:rFonts w:ascii="Arial" w:eastAsia="Arial" w:hAnsi="Arial" w:cs="Arial"/>
+          <w:sz w:val="18"/>
+          <w:szCs w:val="18"/>
+          <w:highlight w:val="lightGray"/>
+        </w:rPr>
+        <w:t xml:space="preserve">: </w:t>
+      </w:r>
+      <w:r>
+        <w:rPr>
+          <w:rFonts w:ascii="Arial" w:eastAsia="Arial" w:hAnsi="Arial" w:cs="Arial"/>
+          <w:b/>
+          <w:bCs/>
+          <w:sz w:val="18"/>
+          <w:szCs w:val="18"/>
+          <w:highlight w:val="lightGray"/>
+        </w:rPr>
+        <w:t>Provided by:</w:t>
+      </w:r>
+      <w:r>
+        <w:rPr>
+          <w:rFonts w:ascii="Arial" w:eastAsia="Arial" w:hAnsi="Arial" w:cs="Arial"/>
+          <w:sz w:val="18"/>
+          <w:szCs w:val="18"/>
+          <w:highlight w:val="lightGray"/>
+        </w:rPr>
+        <w:t xml:space="preserve"> [Persons Table -&gt; ID Column: 1, </w:t>
       </w:r>
       <w:proofErr w:type="spellStart"/>
       <w:r>
         <w:rPr>
           <w:rFonts w:ascii="Arial" w:eastAsia="Arial" w:hAnsi="Arial" w:cs="Arial"/>
-          <w:b/>
-          <w:bCs/>
-          <w:sz w:val="18"/>
-          <w:szCs w:val="18"/>
-          <w:highlight w:val="lightGray"/>
-        </w:rPr>
-        <w:t>ScreenShots</w:t>
+          <w:sz w:val="18"/>
+          <w:szCs w:val="18"/>
+          <w:highlight w:val="lightGray"/>
+        </w:rPr>
+        <w:t>Name_En</w:t>
       </w:r>
       <w:proofErr w:type="spellEnd"/>
       <w:r>
@@ -889,47 +943,27 @@
           <w:szCs w:val="18"/>
           <w:highlight w:val="lightGray"/>
         </w:rPr>
-        <w:t xml:space="preserve"> </w:t>
-      </w:r>
-      <w:r>
-        <w:rPr>
-          <w:rFonts w:ascii="Arial" w:eastAsia="Arial" w:hAnsi="Arial" w:cs="Arial"/>
-          <w:b/>
-          <w:bCs/>
-          <w:sz w:val="18"/>
-          <w:szCs w:val="18"/>
-          <w:highlight w:val="lightGray"/>
-        </w:rPr>
-        <w:t>Source</w:t>
-      </w:r>
-      <w:r>
-        <w:rPr>
-          <w:rFonts w:ascii="Arial" w:eastAsia="Arial" w:hAnsi="Arial" w:cs="Arial"/>
-          <w:sz w:val="18"/>
-          <w:szCs w:val="18"/>
-          <w:highlight w:val="lightGray"/>
-        </w:rPr>
-        <w:t xml:space="preserve">: </w:t>
-      </w:r>
-      <w:r>
-        <w:rPr>
-          <w:rFonts w:ascii="Arial" w:eastAsia="Arial" w:hAnsi="Arial" w:cs="Arial"/>
-          <w:b/>
-          <w:bCs/>
-          <w:sz w:val="18"/>
-          <w:szCs w:val="18"/>
-          <w:highlight w:val="lightGray"/>
-        </w:rPr>
-        <w:t>Provided by:</w:t>
-      </w:r>
-      <w:r>
-        <w:rPr>
-          <w:rFonts w:ascii="Arial" w:eastAsia="Arial" w:hAnsi="Arial" w:cs="Arial"/>
-          <w:sz w:val="18"/>
-          <w:szCs w:val="18"/>
-          <w:highlight w:val="lightGray"/>
-        </w:rPr>
-        <w:t xml:space="preserve"> [Persons Table -&gt; ID Column: 1, </w:t>
+        <w:t xml:space="preserve"> Column: Motasem Essam] -&gt; </w:t>
+      </w:r>
+      <w:r>
+        <w:rPr>
+          <w:rFonts w:ascii="Arial" w:eastAsia="Arial" w:hAnsi="Arial" w:cs="Arial"/>
+          <w:b/>
+          <w:bCs/>
+          <w:sz w:val="18"/>
+          <w:szCs w:val="18"/>
+          <w:highlight w:val="lightGray"/>
+        </w:rPr>
+        <w:t>Tool:</w:t>
+      </w:r>
+      <w:r>
+        <w:rPr>
+          <w:rFonts w:ascii="Arial" w:eastAsia="Arial" w:hAnsi="Arial" w:cs="Arial"/>
+          <w:sz w:val="18"/>
+          <w:szCs w:val="18"/>
+          <w:highlight w:val="lightGray"/>
+        </w:rPr>
+        <w:t xml:space="preserve"> [</w:t>
       </w:r>
       <w:proofErr w:type="spellStart"/>
       <w:r>
@@ -939,7 +973,7 @@
           <w:szCs w:val="18"/>
           <w:highlight w:val="lightGray"/>
         </w:rPr>
-        <w:t>Name_En</w:t>
+        <w:t>Lightshot</w:t>
       </w:r>
       <w:proofErr w:type="spellEnd"/>
       <w:r>
@@ -949,46 +983,6 @@
           <w:szCs w:val="18"/>
           <w:highlight w:val="lightGray"/>
         </w:rPr>
-        <w:t xml:space="preserve"> Column: Motasem Essam] -&gt; </w:t>
-      </w:r>
-      <w:r>
-        <w:rPr>
-          <w:rFonts w:ascii="Arial" w:eastAsia="Arial" w:hAnsi="Arial" w:cs="Arial"/>
-          <w:b/>
-          <w:bCs/>
-          <w:sz w:val="18"/>
-          <w:szCs w:val="18"/>
-          <w:highlight w:val="lightGray"/>
-        </w:rPr>
-        <w:t>Tool:</w:t>
-      </w:r>
-      <w:r>
-        <w:rPr>
-          <w:rFonts w:ascii="Arial" w:eastAsia="Arial" w:hAnsi="Arial" w:cs="Arial"/>
-          <w:sz w:val="18"/>
-          <w:szCs w:val="18"/>
-          <w:highlight w:val="lightGray"/>
-        </w:rPr>
-        <w:t xml:space="preserve"> [</w:t>
-      </w:r>
-      <w:proofErr w:type="spellStart"/>
-      <w:r>
-        <w:rPr>
-          <w:rFonts w:ascii="Arial" w:eastAsia="Arial" w:hAnsi="Arial" w:cs="Arial"/>
-          <w:sz w:val="18"/>
-          <w:szCs w:val="18"/>
-          <w:highlight w:val="lightGray"/>
-        </w:rPr>
-        <w:t>Lightshot</w:t>
-      </w:r>
-      <w:proofErr w:type="spellEnd"/>
-      <w:r>
-        <w:rPr>
-          <w:rFonts w:ascii="Arial" w:eastAsia="Arial" w:hAnsi="Arial" w:cs="Arial"/>
-          <w:sz w:val="18"/>
-          <w:szCs w:val="18"/>
-          <w:highlight w:val="lightGray"/>
-        </w:rPr>
         <w:t xml:space="preserve"> Program] -&gt; </w:t>
       </w:r>
       <w:r>
@@ -1009,7 +1003,7 @@
           <w:szCs w:val="18"/>
           <w:highlight w:val="lightGray"/>
         </w:rPr>
-        <w:t xml:space="preserve">[Site: https://github.com/] </w:t>
+        <w:t xml:space="preserve">[Site: https://github.com] </w:t>
       </w:r>
       <w:r>
         <w:rPr>
@@ -1545,7 +1539,7 @@
           <w:szCs w:val="18"/>
           <w:highlight w:val="lightGray"/>
         </w:rPr>
-        <w:t xml:space="preserve">[Site: https://github.com/] </w:t>
+        <w:t xml:space="preserve">[Site: https://github.com] </w:t>
       </w:r>
       <w:r>
         <w:rPr>
@@ -2358,25 +2352,7 @@
           <w:szCs w:val="18"/>
           <w:highlight w:val="lightGray"/>
         </w:rPr>
-        <w:t>[</w:t>
-      </w:r>
-      <w:r>
-        <w:rPr>
-          <w:rFonts w:ascii="Arial" w:eastAsia="Arial" w:hAnsi="Arial" w:cs="Arial"/>
-          <w:sz w:val="18"/>
-          <w:szCs w:val="18"/>
-          <w:highlight w:val="lightGray"/>
-        </w:rPr>
-        <w:t>Windows</w:t>
-      </w:r>
-      <w:r>
-        <w:rPr>
-          <w:rFonts w:ascii="Arial" w:eastAsia="Arial" w:hAnsi="Arial" w:cs="Arial"/>
-          <w:sz w:val="18"/>
-          <w:szCs w:val="18"/>
-          <w:highlight w:val="lightGray"/>
-        </w:rPr>
-        <w:t xml:space="preserve">] </w:t>
+        <w:t xml:space="preserve">[Site: https://github.com/musickingdomelbaf1-cell/Git_course] </w:t>
       </w:r>
       <w:r>
         <w:rPr>
@@ -2410,63 +2386,7 @@
           <w:lang w:val="en"/>
           <w14:ligatures w14:val="none"/>
         </w:rPr>
-        <w:t>2</w:t>
-      </w:r>
-      <w:r>
-        <w:rPr>
-          <w:rFonts w:ascii="Arial" w:eastAsia="Arial" w:hAnsi="Arial" w:cs="Arial"/>
-          <w:bCs/>
-          <w:kern w:val="0"/>
-          <w:sz w:val="18"/>
-          <w:szCs w:val="14"/>
-          <w:highlight w:val="lightGray"/>
-          <w:shd w:val="clear" w:color="auto" w:fill="B7B7B7"/>
-          <w:lang w:val="en"/>
-          <w14:ligatures w14:val="none"/>
-        </w:rPr>
-        <w:t>/</w:t>
-      </w:r>
-      <w:r>
-        <w:rPr>
-          <w:rFonts w:ascii="Arial" w:eastAsia="Arial" w:hAnsi="Arial" w:cs="Arial"/>
-          <w:bCs/>
-          <w:kern w:val="0"/>
-          <w:sz w:val="18"/>
-          <w:szCs w:val="14"/>
-          <w:highlight w:val="lightGray"/>
-          <w:shd w:val="clear" w:color="auto" w:fill="B7B7B7"/>
-          <w:lang w:val="en"/>
-          <w14:ligatures w14:val="none"/>
-        </w:rPr>
-        <w:t>16</w:t>
-      </w:r>
-      <w:r>
-        <w:rPr>
-          <w:rFonts w:ascii="Arial" w:eastAsia="Arial" w:hAnsi="Arial" w:cs="Arial"/>
-          <w:bCs/>
-          <w:kern w:val="0"/>
-          <w:sz w:val="18"/>
-          <w:szCs w:val="14"/>
-          <w:highlight w:val="lightGray"/>
-          <w:shd w:val="clear" w:color="auto" w:fill="B7B7B7"/>
-          <w:lang w:val="en"/>
-          <w14:ligatures w14:val="none"/>
-        </w:rPr>
-        <w:t>/202</w:t>
-      </w:r>
-      <w:r>
-        <w:rPr>
-          <w:rFonts w:ascii="Arial" w:eastAsia="Arial" w:hAnsi="Arial" w:cs="Arial"/>
-          <w:bCs/>
-          <w:kern w:val="0"/>
-          <w:sz w:val="18"/>
-          <w:szCs w:val="14"/>
-          <w:highlight w:val="lightGray"/>
-          <w:shd w:val="clear" w:color="auto" w:fill="B7B7B7"/>
-          <w:lang w:val="en"/>
-          <w14:ligatures w14:val="none"/>
-        </w:rPr>
-        <w:t>6</w:t>
+        <w:t>2/16/2026</w:t>
       </w:r>
       <w:r>
         <w:rPr>
@@ -2518,6 +2438,278 @@
             </a:graphic>
           </wp:inline>
         </w:drawing>
+      </w:r>
+    </w:p>
+    <w:p>
+      <w:r>
+        <w:rPr>
+          <w:rFonts w:ascii="Arial" w:eastAsia="Arial" w:hAnsi="Arial" w:cs="Arial"/>
+          <w:b/>
+          <w:bCs/>
+          <w:sz w:val="18"/>
+          <w:szCs w:val="18"/>
+          <w:highlight w:val="lightGray"/>
+        </w:rPr>
+        <w:t xml:space="preserve"># Source: </w:t>
+      </w:r>
+      <w:proofErr w:type="spellStart"/>
+      <w:r>
+        <w:rPr>
+          <w:rFonts w:ascii="Arial" w:eastAsia="Arial" w:hAnsi="Arial" w:cs="Arial"/>
+          <w:b/>
+          <w:bCs/>
+          <w:sz w:val="18"/>
+          <w:szCs w:val="18"/>
+          <w:highlight w:val="lightGray"/>
+        </w:rPr>
+        <w:t>ScreenShots</w:t>
+      </w:r>
+      <w:proofErr w:type="spellEnd"/>
+      <w:r>
+        <w:rPr>
+          <w:rFonts w:ascii="Arial" w:eastAsia="Arial" w:hAnsi="Arial" w:cs="Arial"/>
+          <w:sz w:val="18"/>
+          <w:szCs w:val="18"/>
+          <w:highlight w:val="lightGray"/>
+        </w:rPr>
+        <w:t xml:space="preserve"> </w:t>
+      </w:r>
+      <w:r>
+        <w:rPr>
+          <w:rFonts w:ascii="Arial" w:eastAsia="Arial" w:hAnsi="Arial" w:cs="Arial"/>
+          <w:b/>
+          <w:bCs/>
+          <w:sz w:val="18"/>
+          <w:szCs w:val="18"/>
+          <w:highlight w:val="lightGray"/>
+        </w:rPr>
+        <w:t>Source</w:t>
+      </w:r>
+      <w:r>
+        <w:rPr>
+          <w:rFonts w:ascii="Arial" w:eastAsia="Arial" w:hAnsi="Arial" w:cs="Arial"/>
+          <w:sz w:val="18"/>
+          <w:szCs w:val="18"/>
+          <w:highlight w:val="lightGray"/>
+        </w:rPr>
+        <w:t xml:space="preserve">: </w:t>
+      </w:r>
+      <w:r>
+        <w:rPr>
+          <w:rFonts w:ascii="Arial" w:eastAsia="Arial" w:hAnsi="Arial" w:cs="Arial"/>
+          <w:b/>
+          <w:bCs/>
+          <w:sz w:val="18"/>
+          <w:szCs w:val="18"/>
+          <w:highlight w:val="lightGray"/>
+        </w:rPr>
+        <w:t>Provided by:</w:t>
+      </w:r>
+      <w:r>
+        <w:rPr>
+          <w:rFonts w:ascii="Arial" w:eastAsia="Arial" w:hAnsi="Arial" w:cs="Arial"/>
+          <w:sz w:val="18"/>
+          <w:szCs w:val="18"/>
+          <w:highlight w:val="lightGray"/>
+        </w:rPr>
+        <w:t xml:space="preserve"> [Persons Table -&gt; ID Column: 1, </w:t>
+      </w:r>
+      <w:proofErr w:type="spellStart"/>
+      <w:r>
+        <w:rPr>
+          <w:rFonts w:ascii="Arial" w:eastAsia="Arial" w:hAnsi="Arial" w:cs="Arial"/>
+          <w:sz w:val="18"/>
+          <w:szCs w:val="18"/>
+          <w:highlight w:val="lightGray"/>
+        </w:rPr>
+        <w:t>Name_En</w:t>
+      </w:r>
+      <w:proofErr w:type="spellEnd"/>
+      <w:r>
+        <w:rPr>
+          <w:rFonts w:ascii="Arial" w:eastAsia="Arial" w:hAnsi="Arial" w:cs="Arial"/>
+          <w:sz w:val="18"/>
+          <w:szCs w:val="18"/>
+          <w:highlight w:val="lightGray"/>
+        </w:rPr>
+        <w:t xml:space="preserve"> Column: Motasem Essam] -&gt; </w:t>
+      </w:r>
+      <w:r>
+        <w:rPr>
+          <w:rFonts w:ascii="Arial" w:eastAsia="Arial" w:hAnsi="Arial" w:cs="Arial"/>
+          <w:b/>
+          <w:bCs/>
+          <w:sz w:val="18"/>
+          <w:szCs w:val="18"/>
+          <w:highlight w:val="lightGray"/>
+        </w:rPr>
+        <w:t>Tool:</w:t>
+      </w:r>
+      <w:r>
+        <w:rPr>
+          <w:rFonts w:ascii="Arial" w:eastAsia="Arial" w:hAnsi="Arial" w:cs="Arial"/>
+          <w:sz w:val="18"/>
+          <w:szCs w:val="18"/>
+          <w:highlight w:val="lightGray"/>
+        </w:rPr>
+        <w:t xml:space="preserve"> [</w:t>
+      </w:r>
+      <w:proofErr w:type="spellStart"/>
+      <w:r>
+        <w:rPr>
+          <w:rFonts w:ascii="Arial" w:eastAsia="Arial" w:hAnsi="Arial" w:cs="Arial"/>
+          <w:sz w:val="18"/>
+          <w:szCs w:val="18"/>
+          <w:highlight w:val="lightGray"/>
+        </w:rPr>
+        <w:t>Lightshot</w:t>
+      </w:r>
+      <w:proofErr w:type="spellEnd"/>
+      <w:r>
+        <w:rPr>
+          <w:rFonts w:ascii="Arial" w:eastAsia="Arial" w:hAnsi="Arial" w:cs="Arial"/>
+          <w:sz w:val="18"/>
+          <w:szCs w:val="18"/>
+          <w:highlight w:val="lightGray"/>
+        </w:rPr>
+        <w:t xml:space="preserve"> Program] -&gt; </w:t>
+      </w:r>
+      <w:r>
+        <w:rPr>
+          <w:rFonts w:ascii="Arial" w:eastAsia="Arial" w:hAnsi="Arial" w:cs="Arial"/>
+          <w:b/>
+          <w:bCs/>
+          <w:sz w:val="18"/>
+          <w:szCs w:val="18"/>
+          <w:highlight w:val="lightGray"/>
+        </w:rPr>
+        <w:t xml:space="preserve">From </w:t>
+      </w:r>
+      <w:r>
+        <w:rPr>
+          <w:rFonts w:ascii="Arial" w:eastAsia="Arial" w:hAnsi="Arial" w:cs="Arial"/>
+          <w:sz w:val="18"/>
+          <w:szCs w:val="18"/>
+          <w:highlight w:val="lightGray"/>
+        </w:rPr>
+        <w:t>[</w:t>
+      </w:r>
+      <w:r>
+        <w:rPr>
+          <w:rFonts w:ascii="Arial" w:eastAsia="Arial" w:hAnsi="Arial" w:cs="Arial"/>
+          <w:sz w:val="18"/>
+          <w:szCs w:val="18"/>
+          <w:highlight w:val="lightGray"/>
+        </w:rPr>
+        <w:t>Windows</w:t>
+      </w:r>
+      <w:r>
+        <w:rPr>
+          <w:rFonts w:ascii="Arial" w:eastAsia="Arial" w:hAnsi="Arial" w:cs="Arial"/>
+          <w:sz w:val="18"/>
+          <w:szCs w:val="18"/>
+          <w:highlight w:val="lightGray"/>
+        </w:rPr>
+        <w:t xml:space="preserve">] </w:t>
+      </w:r>
+      <w:r>
+        <w:rPr>
+          <w:rFonts w:ascii="Arial" w:eastAsia="Arial" w:hAnsi="Arial" w:cs="Arial"/>
+          <w:b/>
+          <w:bCs/>
+          <w:sz w:val="18"/>
+          <w:szCs w:val="18"/>
+          <w:highlight w:val="lightGray"/>
+        </w:rPr>
+        <w:t>on</w:t>
+      </w:r>
+      <w:r>
+        <w:rPr>
+          <w:rFonts w:ascii="Arial" w:eastAsia="Arial" w:hAnsi="Arial" w:cs="Arial"/>
+          <w:sz w:val="18"/>
+          <w:szCs w:val="18"/>
+          <w:highlight w:val="lightGray"/>
+        </w:rPr>
+        <w:t xml:space="preserve"> [</w:t>
+      </w:r>
+      <w:r>
+        <w:rPr>
+          <w:rFonts w:ascii="Arial" w:eastAsia="Arial" w:hAnsi="Arial" w:cs="Arial"/>
+          <w:bCs/>
+          <w:kern w:val="0"/>
+          <w:sz w:val="18"/>
+          <w:szCs w:val="14"/>
+          <w:highlight w:val="lightGray"/>
+          <w:shd w:val="clear" w:color="auto" w:fill="B7B7B7"/>
+          <w:lang w:val="en"/>
+          <w14:ligatures w14:val="none"/>
+        </w:rPr>
+        <w:t>2</w:t>
+      </w:r>
+      <w:r>
+        <w:rPr>
+          <w:rFonts w:ascii="Arial" w:eastAsia="Arial" w:hAnsi="Arial" w:cs="Arial"/>
+          <w:bCs/>
+          <w:kern w:val="0"/>
+          <w:sz w:val="18"/>
+          <w:szCs w:val="14"/>
+          <w:highlight w:val="lightGray"/>
+          <w:shd w:val="clear" w:color="auto" w:fill="B7B7B7"/>
+          <w:lang w:val="en"/>
+          <w14:ligatures w14:val="none"/>
+        </w:rPr>
+        <w:t>/</w:t>
+      </w:r>
+      <w:r>
+        <w:rPr>
+          <w:rFonts w:ascii="Arial" w:eastAsia="Arial" w:hAnsi="Arial" w:cs="Arial"/>
+          <w:bCs/>
+          <w:kern w:val="0"/>
+          <w:sz w:val="18"/>
+          <w:szCs w:val="14"/>
+          <w:highlight w:val="lightGray"/>
+          <w:shd w:val="clear" w:color="auto" w:fill="B7B7B7"/>
+          <w:lang w:val="en"/>
+          <w14:ligatures w14:val="none"/>
+        </w:rPr>
+        <w:t>16</w:t>
+      </w:r>
+      <w:r>
+        <w:rPr>
+          <w:rFonts w:ascii="Arial" w:eastAsia="Arial" w:hAnsi="Arial" w:cs="Arial"/>
+          <w:bCs/>
+          <w:kern w:val="0"/>
+          <w:sz w:val="18"/>
+          <w:szCs w:val="14"/>
+          <w:highlight w:val="lightGray"/>
+          <w:shd w:val="clear" w:color="auto" w:fill="B7B7B7"/>
+          <w:lang w:val="en"/>
+          <w14:ligatures w14:val="none"/>
+        </w:rPr>
+        <w:t>/202</w:t>
+      </w:r>
+      <w:r>
+        <w:rPr>
+          <w:rFonts w:ascii="Arial" w:eastAsia="Arial" w:hAnsi="Arial" w:cs="Arial"/>
+          <w:bCs/>
+          <w:kern w:val="0"/>
+          <w:sz w:val="18"/>
+          <w:szCs w:val="14"/>
+          <w:highlight w:val="lightGray"/>
+          <w:shd w:val="clear" w:color="auto" w:fill="B7B7B7"/>
+          <w:lang w:val="en"/>
+          <w14:ligatures w14:val="none"/>
+        </w:rPr>
+        <w:t>6</w:t>
+      </w:r>
+      <w:r>
+        <w:rPr>
+          <w:rFonts w:ascii="Arial" w:eastAsia="Arial" w:hAnsi="Arial" w:cs="Arial"/>
+          <w:sz w:val="18"/>
+          <w:szCs w:val="18"/>
+          <w:highlight w:val="lightGray"/>
+        </w:rPr>
+        <w:t>]</w:t>
       </w:r>
     </w:p>
     <w:p>
@@ -3262,7 +3454,7 @@
           <w:rFonts w:ascii="Roboto Mono" w:hAnsi="Roboto Mono"/>
         </w:rPr>
         <w:pict w14:anchorId="08E5810A">
-          <v:rect id="_x0000_i1171" style="width:0;height:1.5pt" o:hralign="center" o:hrstd="t" o:hr="t" fillcolor="#a0a0a0" stroked="f"/>
+          <v:rect id="_x0000_i1025" style="width:0;height:1.5pt" o:hralign="center" o:hrstd="t" o:hr="t" fillcolor="#a0a0a0" stroked="f"/>
         </w:pict>
       </w:r>
     </w:p>
@@ -3578,7 +3770,7 @@
           <w:rFonts w:ascii="Roboto Mono" w:hAnsi="Roboto Mono"/>
         </w:rPr>
         <w:pict w14:anchorId="679406F7">
-          <v:rect id="_x0000_i1172" style="width:0;height:1.5pt" o:hralign="center" o:hrstd="t" o:hr="t" fillcolor="#a0a0a0" stroked="f"/>
+          <v:rect id="_x0000_i1026" style="width:0;height:1.5pt" o:hralign="center" o:hrstd="t" o:hr="t" fillcolor="#a0a0a0" stroked="f"/>
         </w:pict>
       </w:r>
     </w:p>
@@ -3803,7 +3995,7 @@
           <w:rFonts w:ascii="Roboto Mono" w:hAnsi="Roboto Mono"/>
         </w:rPr>
         <w:pict w14:anchorId="34DC239F">
-          <v:rect id="_x0000_i1173" style="width:0;height:1.5pt" o:hralign="center" o:hrstd="t" o:hr="t" fillcolor="#a0a0a0" stroked="f"/>
+          <v:rect id="_x0000_i1027" style="width:0;height:1.5pt" o:hralign="center" o:hrstd="t" o:hr="t" fillcolor="#a0a0a0" stroked="f"/>
         </w:pict>
       </w:r>
     </w:p>
@@ -3993,7 +4185,7 @@
           <w:rFonts w:ascii="Roboto Mono" w:hAnsi="Roboto Mono"/>
         </w:rPr>
         <w:pict w14:anchorId="7C4F6832">
-          <v:rect id="_x0000_i1174" style="width:0;height:1.5pt" o:hralign="center" o:hrstd="t" o:hr="t" fillcolor="#a0a0a0" stroked="f"/>
+          <v:rect id="_x0000_i1028" style="width:0;height:1.5pt" o:hralign="center" o:hrstd="t" o:hr="t" fillcolor="#a0a0a0" stroked="f"/>
         </w:pict>
       </w:r>
     </w:p>
@@ -4185,7 +4377,7 @@
           <w:rFonts w:ascii="Roboto Mono" w:hAnsi="Roboto Mono"/>
         </w:rPr>
         <w:pict w14:anchorId="0D5D336A">
-          <v:rect id="_x0000_i1175" style="width:0;height:1.5pt" o:hralign="center" o:hrstd="t" o:hr="t" fillcolor="#a0a0a0" stroked="f"/>
+          <v:rect id="_x0000_i1029" style="width:0;height:1.5pt" o:hralign="center" o:hrstd="t" o:hr="t" fillcolor="#a0a0a0" stroked="f"/>
         </w:pict>
       </w:r>
     </w:p>
@@ -4375,7 +4567,7 @@
           <w:rFonts w:ascii="Roboto Mono" w:hAnsi="Roboto Mono"/>
         </w:rPr>
         <w:pict w14:anchorId="4B8A16B0">
-          <v:rect id="_x0000_i1176" style="width:0;height:1.5pt" o:hralign="center" o:hrstd="t" o:hr="t" fillcolor="#a0a0a0" stroked="f"/>
+          <v:rect id="_x0000_i1030" style="width:0;height:1.5pt" o:hralign="center" o:hrstd="t" o:hr="t" fillcolor="#a0a0a0" stroked="f"/>
         </w:pict>
       </w:r>
     </w:p>
@@ -4559,7 +4751,7 @@
           <w:rFonts w:ascii="Roboto Mono" w:hAnsi="Roboto Mono"/>
         </w:rPr>
         <w:pict w14:anchorId="0B954C16">
-          <v:rect id="_x0000_i1177" style="width:0;height:1.5pt" o:hralign="center" o:hrstd="t" o:hr="t" fillcolor="#a0a0a0" stroked="f"/>
+          <v:rect id="_x0000_i1031" style="width:0;height:1.5pt" o:hralign="center" o:hrstd="t" o:hr="t" fillcolor="#a0a0a0" stroked="f"/>
         </w:pict>
       </w:r>
     </w:p>
@@ -4612,7 +4804,7 @@
           <w:rFonts w:ascii="Roboto Mono" w:hAnsi="Roboto Mono"/>
         </w:rPr>
         <w:pict w14:anchorId="79949BEA">
-          <v:rect id="_x0000_i1178" style="width:0;height:1.5pt" o:hralign="center" o:hrstd="t" o:hr="t" fillcolor="#a0a0a0" stroked="f"/>
+          <v:rect id="_x0000_i1032" style="width:0;height:1.5pt" o:hralign="center" o:hrstd="t" o:hr="t" fillcolor="#a0a0a0" stroked="f"/>
         </w:pict>
       </w:r>
     </w:p>
@@ -9357,16 +9549,10 @@
         <w:t>Error</w:t>
       </w:r>
       <w:r>
-        <w:t xml:space="preserve"> </w:t>
-      </w:r>
-      <w:r>
-        <w:t>remote origin already exists</w:t>
-      </w:r>
-      <w:r>
-        <w:t xml:space="preserve"> </w:t>
-      </w:r>
-      <w:r>
-        <w:t>Error</w:t>
+        <w:t xml:space="preserve"> remote origin already exists</w:t>
+      </w:r>
+      <w:r>
+        <w:t xml:space="preserve"> Error</w:t>
       </w:r>
     </w:p>
     <w:p>
@@ -10851,16 +11037,7 @@
         <w:pStyle w:val="Heading5"/>
       </w:pPr>
       <w:r>
-        <w:t xml:space="preserve">At Step </w:t>
-      </w:r>
-      <w:r>
-        <w:t>8</w:t>
-      </w:r>
-      <w:r>
-        <w:t>:</w:t>
-      </w:r>
-      <w:r>
-        <w:t xml:space="preserve"> </w:t>
+        <w:t xml:space="preserve">At Step 8: </w:t>
       </w:r>
       <w:r>
         <w:t>Permission</w:t>
@@ -12772,6 +12949,7 @@
   <w:style w:type="character" w:default="1" w:styleId="DefaultParagraphFont">
     <w:name w:val="Default Paragraph Font"/>
     <w:uiPriority w:val="1"/>
+    <w:semiHidden/>
     <w:unhideWhenUsed/>
   </w:style>
   <w:style w:type="table" w:default="1" w:styleId="TableNormal">

</xml_diff>